<commit_message>
MERIDIAN 1.0.1: time-zone fix, hash-locked dependencies, CI hardening, roadmap
Fixed
- Unknown time-zone names no longer fall back to UTC silently. tzdata is a
  dependency (Windows has no time-zone database), unknown zones raise, and
  sources are validated at start-up (unique keys, known formats, valid zones).

Changed
- requirements.txt and requirements-dev.txt are hash-locked; the image
  installs with --require-hashes.
- CI: actions pinned to commit SHAs, persist-credentials off, timeouts,
  Trivy image scan and CycloneDX SBOM, optional LODESTAR_READ_TOKEN for the
  contract test.
- Dockerfile lists the collect role and exposes 6514.

Added
- Dependabot, CODEOWNERS, CHANGELOG, docs/ROADMAP.md and
  scripts/create_roadmap_issues.ps1 (phases as milestones and issues).

Co-Authored-By: Claude Opus 5.5 <noreply@anthropic.com>
Claude-Session: https://claude.ai/code/session_01YYxbsNXFgW9w6EVfn4Ufmm
</commit_message>
<xml_diff>
--- a/docs/word/MERIDIAN-Deployment-Guide.docx
+++ b/docs/word/MERIDIAN-Deployment-Guide.docx
@@ -185,7 +185,7 @@
                 <w:sz w:val="18"/>
                 <w:szCs w:val="18"/>
               </w:rPr>
-              <w:t xml:space="preserve">MERIDIAN 1.0.0 - SIEM-less detection, investigation and response with AI agents over MCP</w:t>
+              <w:t xml:space="preserve">MERIDIAN 1.0.1 - SIEM-less detection, investigation and response with AI agents over MCP</w:t>
             </w:r>
           </w:p>
         </w:tc>
@@ -365,7 +365,7 @@
                 <w:sz w:val="18"/>
                 <w:szCs w:val="18"/>
               </w:rPr>
-              <w:t xml:space="preserve">1.0.0 / 2026-10-01</w:t>
+              <w:t xml:space="preserve">1.0.1 / 2026-10-02</w:t>
             </w:r>
           </w:p>
         </w:tc>
@@ -4672,7 +4672,7 @@
           <w:sz w:val="17"/>
           <w:szCs w:val="17"/>
         </w:rPr>
-        <w:t xml:space="preserve">docker build -t meridian:1.0.0 .</w:t>
+        <w:t xml:space="preserve">docker build -t meridian:1.0.1 .</w:t>
       </w:r>
     </w:p>
     <w:p>
@@ -4695,7 +4695,7 @@
           <w:sz w:val="19"/>
           <w:szCs w:val="19"/>
         </w:rPr>
-        <w:t xml:space="preserve">docker run --rm meridian:1.0.0 rules --check</w:t>
+        <w:t xml:space="preserve">docker run --rm meridian:1.0.1 rules --check</w:t>
       </w:r>
       <w:r>
         <w:t xml:space="preserve"> prints </w:t>
@@ -6126,7 +6126,7 @@
           <w:sz w:val="17"/>
           <w:szCs w:val="17"/>
         </w:rPr>
-        <w:t xml:space="preserve">az acr build --registry $ACR --image meridian:1.0.0 .</w:t>
+        <w:t xml:space="preserve">az acr build --registry $ACR --image meridian:1.0.1 .</w:t>
       </w:r>
     </w:p>
     <w:p>
@@ -6160,7 +6160,7 @@
           <w:sz w:val="19"/>
           <w:szCs w:val="19"/>
         </w:rPr>
-        <w:t xml:space="preserve">1.0.0</w:t>
+        <w:t xml:space="preserve">1.0.1</w:t>
       </w:r>
       <w:r>
         <w:t xml:space="preserve">.</w:t>
@@ -6601,7 +6601,7 @@
           <w:sz w:val="19"/>
           <w:szCs w:val="19"/>
         </w:rPr>
-        <w:t xml:space="preserve">&lt;acr&gt;.azurecr.io/meridian:1.0.0</w:t>
+        <w:t xml:space="preserve">&lt;acr&gt;.azurecr.io/meridian:1.0.1</w:t>
       </w:r>
       <w:r>
         <w:t xml:space="preserve">), </w:t>
@@ -8698,7 +8698,7 @@
           <w:sz w:val="17"/>
           <w:szCs w:val="17"/>
         </w:rPr>
-        <w:t xml:space="preserve">docker buildx build --platform linux/arm64 -t $ECR/meridian:1.0.0 --push .</w:t>
+        <w:t xml:space="preserve">docker buildx build --platform linux/arm64 -t $ECR/meridian:1.0.1 --push .</w:t>
       </w:r>
     </w:p>
     <w:p>
@@ -8732,7 +8732,7 @@
           <w:sz w:val="19"/>
           <w:szCs w:val="19"/>
         </w:rPr>
-        <w:t xml:space="preserve">1.0.0</w:t>
+        <w:t xml:space="preserve">1.0.1</w:t>
       </w:r>
       <w:r>
         <w:t xml:space="preserve">, and the scan shows no critical findings.</w:t>
@@ -8865,7 +8865,7 @@
           <w:sz w:val="19"/>
           <w:szCs w:val="19"/>
         </w:rPr>
-        <w:t xml:space="preserve">$ECR/meridian:1.0.0</w:t>
+        <w:t xml:space="preserve">$ECR/meridian:1.0.1</w:t>
       </w:r>
       <w:r>
         <w:t xml:space="preserve">);</w:t>
@@ -9725,7 +9725,7 @@
           <w:sz w:val="17"/>
           <w:szCs w:val="17"/>
         </w:rPr>
-        <w:t xml:space="preserve">terraform apply -var image=$ECR/meridian:1.0.0-&lt;build&gt;</w:t>
+        <w:t xml:space="preserve">terraform apply -var image=$ECR/meridian:1.0.1-&lt;build&gt;</w:t>
       </w:r>
     </w:p>
     <w:p>
@@ -25389,7 +25389,7 @@
         <w:sz w:val="16"/>
         <w:szCs w:val="16"/>
       </w:rPr>
-      <w:t xml:space="preserve">MERIDIAN 1.0.0 - Deployment Guide</w:t>
+      <w:t xml:space="preserve">MERIDIAN 1.0.1 - Deployment Guide</w:t>
     </w:r>
   </w:p>
 </w:hdr>

</xml_diff>